<commit_message>
Fix: article text now includes Vancouver reference list (was missing in submission package); rebuild zip; sync guide word count
</commit_message>
<xml_diff>
--- a/submission/01_Article_Text.docx
+++ b/submission/01_Article_Text.docx
@@ -385,6 +385,76 @@
         <w:t>Conflicts of Interest: The authors declare no conflicts of interest.</w:t>
       </w:r>
     </w:p>
+    <w:p>
+      <w:r>
+        <w:rPr>
+          <w:rFonts w:ascii="Times New Roman" w:hAnsi="Times New Roman"/>
+          <w:b/>
+          <w:sz w:val="26"/>
+        </w:rPr>
+        <w:t>References</w:t>
+      </w:r>
+    </w:p>
+    <w:p>
+      <w:r>
+        <w:t>1. Collet JP, Thiele H, Barbato E, et al. 2020 ESC Guidelines for the management of acute coronary syndromes in patients presenting without persistent ST-segment elevation. Eur Heart J. 2021;42:1289-1367. doi:10.1093/eurheartj/ehaa575.</w:t>
+      </w:r>
+    </w:p>
+    <w:p>
+      <w:r>
+        <w:t>2. Byrne RA, Rossello X, Coughlan JJ, et al. 2023 ESC Guidelines for the management of acute coronary syndromes. Eur Heart J. 2023;44:3720-3826. doi:10.1093/eurheartj/ehad191.</w:t>
+      </w:r>
+    </w:p>
+    <w:p>
+      <w:r>
+        <w:t>3. Fox KAA, Dabbous OH, Goldberg RJ, et al. Prediction of risk of death and myocardial infarction in the six months after presentation with acute coronary syndrome: prospective multinational observational study (GRACE). BMJ. 2006;333:1091. doi:10.1136/bmj.38985.646481.55.</w:t>
+      </w:r>
+    </w:p>
+    <w:p>
+      <w:r>
+        <w:t>4. Granger CB, Goldberg RJ, Dabbous O, et al. Predictors of hospital mortality in the Global Registry of Acute Coronary Events. Arch Intern Med. 2003;163:2345-2353. doi:10.1001/archinte.163.19.2345.</w:t>
+      </w:r>
+    </w:p>
+    <w:p>
+      <w:r>
+        <w:t>5. Killip T 3rd, Kimball JT. Treatment of myocardial infarction in a coronary care unit: a two year experience with 250 patients. Am J Cardiol. 1967;20(4):457-464. doi:10.1016/0002-9149(67)90023-9.</w:t>
+      </w:r>
+    </w:p>
+    <w:p>
+      <w:r>
+        <w:t>6. Breiman L. Random forests. Mach Learn. 2001;45:5-32. doi:10.1023/A:1010933404324.</w:t>
+      </w:r>
+    </w:p>
+    <w:p>
+      <w:r>
+        <w:t>7. Collins GS, Moons KGM, Dhiman P, et al. TRIPOD+AI statement: updated guidance for reporting clinical prediction models that use regression or machine learning methods. BMJ. 2024;385:e078378. doi:10.1136/bmj-2023-078378.</w:t>
+      </w:r>
+    </w:p>
+    <w:p>
+      <w:r>
+        <w:t>8. van Smeden M, Moons KGM, de Groot JAH, et al. Sample size for binary logistic prediction models: beyond events per variable criteria. Stat Methods Med Res. 2019;28(8):2455-2474. doi:10.1177/0962280218784726.</w:t>
+      </w:r>
+    </w:p>
+    <w:p>
+      <w:r>
+        <w:t>9. Steyerberg EW, Uno H, Ioannidis JPA, et al. Poor performance of clinical prediction models: the harm of commonly applied methods. J Clin Epidemiol. 2018;98:133-143. doi:10.1016/j.jclinepi.2017.11.013.</w:t>
+      </w:r>
+    </w:p>
+    <w:p>
+      <w:r>
+        <w:t>10. Van Calster B, McLernon DJ, van Smeden M, Wynants L, Steyerberg EW. Calibration: the Achilles heel of predictive analytics. BMC Med. 2019;17:230. doi:10.1186/s12916-019-1466-7.</w:t>
+      </w:r>
+    </w:p>
+    <w:p>
+      <w:r>
+        <w:t>11. DeLong ER, DeLong DM, Clarke-Pearson DL. Comparing the areas under two or more correlated receiver operating characteristic curves: a nonparametric approach. Biometrics. 1988;44(3):837-845. doi:10.2307/2531595.</w:t>
+      </w:r>
+    </w:p>
+    <w:p>
+      <w:r>
+        <w:t>12. Vickers AJ, Elkin EB. Decision curve analysis: a novel method for evaluating prediction models. Med Decis Making. 2006;26(6):565-574. doi:10.1177/0272989X06295361.</w:t>
+      </w:r>
+    </w:p>
     <w:sectPr>
       <w:pgSz w:w="11906" w:h="16838"/>
       <w:pgMar w:top="1417" w:right="1417" w:bottom="1417" w:left="1417" w:header="720" w:footer="720" w:gutter="0"/>

</xml_diff>